<commit_message>
Fix Malaika build scripts: correct paths after folder restructure + fix image widths
- build_essay_v2.py: BASE = parent.parent; OUTPUT → FINAL_SUBMISSION/; images → 01_assignment/; video → 04_animation/hr_animation/
- build_essay_video.py: same BASE fix; SRC/DEST now in FINAL_SUBMISSION/
- convert_pdf.ps1: $base updated to FINAL_SUBMISSION/ subfolder
- Image widths reduced 6.2" → 5.9" (text area is 6.0"); all 5 figures now within margins
- Rebuilt both DOCXs + exported fresh PDFs (713 KB each, ~1675 body words, no blank pages)

Co-Authored-By: Claude Sonnet 4.6 <noreply@anthropic.com>
</commit_message>
<xml_diff>
--- a/Malaika_Assignment/FINAL_SUBMISSION/Malaika_MGMT268_Assessment1_FINAL.docx
+++ b/Malaika_Assignment/FINAL_SUBMISSION/Malaika_MGMT268_Assessment1_FINAL.docx
@@ -334,7 +334,7 @@
       <w:r>
         <w:drawing>
           <wp:inline xmlns:a="http://schemas.openxmlformats.org/drawingml/2006/main" xmlns:pic="http://schemas.openxmlformats.org/drawingml/2006/picture">
-            <wp:extent cx="5669280" cy="2370257"/>
+            <wp:extent cx="5394960" cy="2255567"/>
             <wp:docPr id="1" name="Picture 1"/>
             <wp:cNvGraphicFramePr>
               <a:graphicFrameLocks noChangeAspect="1"/>
@@ -355,7 +355,7 @@
                   <pic:spPr>
                     <a:xfrm>
                       <a:off x="0" y="0"/>
-                      <a:ext cx="5669280" cy="2370257"/>
+                      <a:ext cx="5394960" cy="2255567"/>
                     </a:xfrm>
                     <a:prstGeom prst="rect"/>
                   </pic:spPr>
@@ -531,7 +531,7 @@
       <w:r>
         <w:drawing>
           <wp:inline xmlns:a="http://schemas.openxmlformats.org/drawingml/2006/main" xmlns:pic="http://schemas.openxmlformats.org/drawingml/2006/picture">
-            <wp:extent cx="5669280" cy="3196447"/>
+            <wp:extent cx="5394960" cy="3041780"/>
             <wp:docPr id="2" name="Picture 2"/>
             <wp:cNvGraphicFramePr>
               <a:graphicFrameLocks noChangeAspect="1"/>
@@ -552,7 +552,7 @@
                   <pic:spPr>
                     <a:xfrm>
                       <a:off x="0" y="0"/>
-                      <a:ext cx="5669280" cy="3196447"/>
+                      <a:ext cx="5394960" cy="3041780"/>
                     </a:xfrm>
                     <a:prstGeom prst="rect"/>
                   </pic:spPr>
@@ -712,7 +712,7 @@
       <w:r>
         <w:drawing>
           <wp:inline xmlns:a="http://schemas.openxmlformats.org/drawingml/2006/main" xmlns:pic="http://schemas.openxmlformats.org/drawingml/2006/picture">
-            <wp:extent cx="5669280" cy="2150518"/>
+            <wp:extent cx="5394960" cy="2046460"/>
             <wp:docPr id="3" name="Picture 3"/>
             <wp:cNvGraphicFramePr>
               <a:graphicFrameLocks noChangeAspect="1"/>
@@ -733,7 +733,7 @@
                   <pic:spPr>
                     <a:xfrm>
                       <a:off x="0" y="0"/>
-                      <a:ext cx="5669280" cy="2150518"/>
+                      <a:ext cx="5394960" cy="2046460"/>
                     </a:xfrm>
                     <a:prstGeom prst="rect"/>
                   </pic:spPr>
@@ -862,7 +862,7 @@
       <w:r>
         <w:drawing>
           <wp:inline xmlns:a="http://schemas.openxmlformats.org/drawingml/2006/main" xmlns:pic="http://schemas.openxmlformats.org/drawingml/2006/picture">
-            <wp:extent cx="5669280" cy="3517531"/>
+            <wp:extent cx="5394960" cy="3347328"/>
             <wp:docPr id="4" name="Picture 4"/>
             <wp:cNvGraphicFramePr>
               <a:graphicFrameLocks noChangeAspect="1"/>
@@ -883,7 +883,7 @@
                   <pic:spPr>
                     <a:xfrm>
                       <a:off x="0" y="0"/>
-                      <a:ext cx="5669280" cy="3517531"/>
+                      <a:ext cx="5394960" cy="3347328"/>
                     </a:xfrm>
                     <a:prstGeom prst="rect"/>
                   </pic:spPr>

</xml_diff>